<commit_message>
Bump to v1.1.1 — Season 5, new items/classes, compendium crash fix
- Add Season 5 (Data Squad) classes, items, and packs
- Add Season 4 Duskmon and Lowemon classes
- Add Season 2 Homemade Onigiri item
- Fix compendium crash: remove blank-name move entry that broke DocumentIndex during setupGame (caused live-update/refresh bug for all players)
- Add rulebook compendium pack
- Add build tools and update scripts
- Add reference PDFs for all seasons

Co-Authored-By: Claude Sonnet 4.6 <noreply@anthropic.com>
</commit_message>
<xml_diff>
--- a/Books/TamersBond_ANewDestiny_v0.1.docx
+++ b/Books/TamersBond_ANewDestiny_v0.1.docx
@@ -3366,7 +3366,7 @@
                 <w:sz w:val="20"/>
                 <w:szCs w:val="20"/>
               </w:rPr>
-              <w:t xml:space="preserve">Measured Response   </w:t>
+              <w:t xml:space="preserve">Calculated Response   </w:t>
             </w:r>
             <w:r>
               <w:rPr>
@@ -10449,7 +10449,7 @@
                 <w:sz w:val="20"/>
                 <w:szCs w:val="20"/>
               </w:rPr>
-              <w:t xml:space="preserve">Flamedramon</w:t>
+              <w:t xml:space="preserve">Fladramon</w:t>
             </w:r>
             <w:r>
               <w:rPr>
@@ -10490,7 +10490,7 @@
                 <w:sz w:val="20"/>
                 <w:szCs w:val="20"/>
               </w:rPr>
-              <w:t xml:space="preserve">When the Tamer spends their Basic Action, the Digimon immediately Armor Digivolves into Flamedramon. The form lasts 7 turns. No Hope cost. Compatible species are documented in the Season 2 Digimon compendium. See Part 2: Rules for full Armor Digivolution rules.</w:t>
+              <w:t xml:space="preserve">When the Tamer spends their Basic Action, the Digimon immediately Armor Digivolves into Fladramon. The form lasts 7 turns. No Hope cost. Compatible species are documented in the Season 2 Digimon compendium. See Part 2: Rules for full Armor Digivolution rules.</w:t>
             </w:r>
           </w:p>
           <w:p>
@@ -10504,7 +10504,7 @@
                 <w:sz w:val="20"/>
                 <w:szCs w:val="20"/>
               </w:rPr>
-              <w:t xml:space="preserve">The Digi-Egg of Courage burns with a fire that does not consume — it drives forward. Flamedramon moves fast, strikes hard, and never hesitates.</w:t>
+              <w:t xml:space="preserve">The Digi-Egg of Courage burns with a fire that does not consume — it drives forward. Fladramon moves fast, strikes hard, and never hesitates.</w:t>
             </w:r>
           </w:p>
         </w:tc>
@@ -10837,7 +10837,7 @@
                 <w:sz w:val="20"/>
                 <w:szCs w:val="20"/>
               </w:rPr>
-              <w:t xml:space="preserve">Halsemon</w:t>
+              <w:t xml:space="preserve">Holsmon</w:t>
             </w:r>
             <w:r>
               <w:rPr>
@@ -10878,7 +10878,7 @@
                 <w:sz w:val="20"/>
                 <w:szCs w:val="20"/>
               </w:rPr>
-              <w:t xml:space="preserve">When the Tamer spends their Basic Action, the Digimon immediately Armor Digivolves into Halsemon. The form lasts 7 turns. No Hope cost. Compatible species are documented in the Season 2 Digimon compendium. See Part 2: Rules for full Armor Digivolution rules.</w:t>
+              <w:t xml:space="preserve">When the Tamer spends their Basic Action, the Digimon immediately Armor Digivolves into Holsmon. The form lasts 7 turns. No Hope cost. Compatible species are documented in the Season 2 Digimon compendium. See Part 2: Rules for full Armor Digivolution rules.</w:t>
             </w:r>
           </w:p>
           <w:p>
@@ -10892,7 +10892,7 @@
                 <w:sz w:val="20"/>
                 <w:szCs w:val="20"/>
               </w:rPr>
-              <w:t xml:space="preserve">Love lifts things higher than they could go alone. Halsemon takes to the sky and sees everything from above.</w:t>
+              <w:t xml:space="preserve">Love lifts things higher than they could go alone. Holsmon takes to the sky and sees everything from above.</w:t>
             </w:r>
           </w:p>
         </w:tc>
@@ -11613,7 +11613,7 @@
                 <w:sz w:val="20"/>
                 <w:szCs w:val="20"/>
               </w:rPr>
-              <w:t xml:space="preserve">Pegasusmon</w:t>
+              <w:t xml:space="preserve">Pegasmon</w:t>
             </w:r>
             <w:r>
               <w:rPr>
@@ -11654,7 +11654,7 @@
                 <w:sz w:val="20"/>
                 <w:szCs w:val="20"/>
               </w:rPr>
-              <w:t xml:space="preserve">When the Tamer spends their Basic Action, the Digimon immediately Armor Digivolves into Pegasusmon. The form lasts 7 turns. No Hope cost. Compatible species are documented in the Season 2 Digimon compendium. See Part 2: Rules for full Armor Digivolution rules.</w:t>
+              <w:t xml:space="preserve">When the Tamer spends their Basic Action, the Digimon immediately Armor Digivolves into Pegasmon. The form lasts 7 turns. No Hope cost. Compatible species are documented in the Season 2 Digimon compendium. See Part 2: Rules for full Armor Digivolution rules.</w:t>
             </w:r>
           </w:p>
           <w:p>
@@ -11668,7 +11668,7 @@
                 <w:sz w:val="20"/>
                 <w:szCs w:val="20"/>
               </w:rPr>
-              <w:t xml:space="preserve">Hope takes flight. Pegasusmon soars above the battlefield, radiant and impossible to ignore.</w:t>
+              <w:t xml:space="preserve">Hope takes flight. Pegasmon soars above the battlefield, radiant and impossible to ignore.</w:t>
             </w:r>
           </w:p>
         </w:tc>
@@ -12001,7 +12001,7 @@
                 <w:sz w:val="20"/>
                 <w:szCs w:val="20"/>
               </w:rPr>
-              <w:t xml:space="preserve">Bucchiemon</w:t>
+              <w:t xml:space="preserve">Pucchiemon</w:t>
             </w:r>
             <w:r>
               <w:rPr>
@@ -12042,7 +12042,7 @@
                 <w:sz w:val="20"/>
                 <w:szCs w:val="20"/>
               </w:rPr>
-              <w:t xml:space="preserve">When the Tamer spends their Basic Action, the Digimon immediately Armor Digivolves into Bucchiemon. The form lasts 7 turns. No Hope cost. Compatible species are documented in the Season 2 Digimon compendium. See Part 2: Rules for full Armor Digivolution rules.</w:t>
+              <w:t xml:space="preserve">When the Tamer spends their Basic Action, the Digimon immediately Armor Digivolves into Pucchiemon. The form lasts 7 turns. No Hope cost. Compatible species are documented in the Season 2 Digimon compendium. See Part 2: Rules for full Armor Digivolution rules.</w:t>
             </w:r>
           </w:p>
           <w:p>
@@ -12056,7 +12056,7 @@
                 <w:sz w:val="20"/>
                 <w:szCs w:val="20"/>
               </w:rPr>
-              <w:t xml:space="preserve">Kindness is not weakness. Bucchiemon moves with a gentleness that disarms — and then hits harder than anyone expected.</w:t>
+              <w:t xml:space="preserve">Kindness is not weakness. Pucchiemon moves with a gentleness that disarms — and then hits harder than anyone expected.</w:t>
             </w:r>
           </w:p>
         </w:tc>
@@ -14223,7 +14223,7 @@
                 <w:sz w:val="22"/>
                 <w:szCs w:val="22"/>
               </w:rPr>
-              <w:t xml:space="preserve">Ken's Onigiri</w:t>
+              <w:t xml:space="preserve">Homemade Onigiri</w:t>
             </w:r>
           </w:p>
         </w:tc>

</xml_diff>